<commit_message>
Updated the sources of NFR-012 and NFR-013
</commit_message>
<xml_diff>
--- a/docs/requirements-acceptance.docx
+++ b/docs/requirements-acceptance.docx
@@ -6693,8 +6693,17 @@
                 <w:rFonts w:ascii="Times New Roman" w:hAnsi="Times New Roman" w:cs="Times New Roman"/>
                 <w:sz w:val="16"/>
                 <w:szCs w:val="16"/>
-              </w:rPr>
-              <w:t>General Emergency</w:t>
+                <w:lang w:val="en-US"/>
+              </w:rPr>
+              <w:t>STK-006</w:t>
+            </w:r>
+            <w:r>
+              <w:rPr>
+                <w:rFonts w:ascii="Times New Roman" w:hAnsi="Times New Roman" w:cs="Times New Roman"/>
+                <w:sz w:val="16"/>
+                <w:szCs w:val="16"/>
+              </w:rPr>
+              <w:t> </w:t>
             </w:r>
           </w:p>
         </w:tc>
@@ -6813,9 +6822,46 @@
                 <w:rFonts w:ascii="Times New Roman" w:hAnsi="Times New Roman" w:cs="Times New Roman"/>
                 <w:sz w:val="16"/>
                 <w:szCs w:val="16"/>
-              </w:rPr>
-              <w:t>Past similar project</w:t>
-            </w:r>
+                <w:lang w:val="en-US"/>
+              </w:rPr>
+              <w:t>Past similar project /</w:t>
+            </w:r>
+            <w:r>
+              <w:rPr>
+                <w:rFonts w:ascii="Times New Roman" w:hAnsi="Times New Roman" w:cs="Times New Roman"/>
+                <w:sz w:val="16"/>
+                <w:szCs w:val="16"/>
+              </w:rPr>
+              <w:t> </w:t>
+            </w:r>
+          </w:p>
+          <w:p>
+            <w:pPr>
+              <w:rPr>
+                <w:rFonts w:ascii="Times New Roman" w:hAnsi="Times New Roman" w:cs="Times New Roman"/>
+                <w:sz w:val="16"/>
+                <w:szCs w:val="16"/>
+                <w:lang w:val="en-US"/>
+              </w:rPr>
+            </w:pPr>
+            <w:r>
+              <w:rPr>
+                <w:rFonts w:ascii="Times New Roman" w:hAnsi="Times New Roman" w:cs="Times New Roman"/>
+                <w:sz w:val="16"/>
+                <w:szCs w:val="16"/>
+                <w:lang w:val="en-US"/>
+              </w:rPr>
+              <w:t>Project Master Brief </w:t>
+            </w:r>
+          </w:p>
+          <w:p>
+            <w:pPr>
+              <w:rPr>
+                <w:rFonts w:ascii="Times New Roman" w:hAnsi="Times New Roman" w:cs="Times New Roman"/>
+                <w:sz w:val="16"/>
+                <w:szCs w:val="16"/>
+              </w:rPr>
+            </w:pPr>
           </w:p>
         </w:tc>
         <w:tc>
@@ -6986,7 +7032,10 @@
     <w:sdt>
       <w:sdtPr>
         <w:rPr>
-          <w:rFonts w:ascii="Times New Roman" w:hAnsi="Times New Roman" w:cs="Times New Roman"/>
+          <w:rFonts w:ascii="Times New Roman" w:eastAsiaTheme="minorHAnsi" w:hAnsi="Times New Roman" w:cs="Times New Roman"/>
+          <w:color w:val="auto"/>
+          <w:sz w:val="24"/>
+          <w:szCs w:val="24"/>
           <w:lang w:val="en-GB"/>
         </w:rPr>
         <w:id w:val="-274024480"/>
@@ -6997,10 +7046,6 @@
       </w:sdtPr>
       <w:sdtEndPr>
         <w:rPr>
-          <w:rFonts w:eastAsiaTheme="minorHAnsi"/>
-          <w:color w:val="auto"/>
-          <w:sz w:val="24"/>
-          <w:szCs w:val="24"/>
           <w:lang w:val="en-ZA"/>
         </w:rPr>
       </w:sdtEndPr>
@@ -7914,7 +7959,6 @@
   <w:style w:type="character" w:default="1" w:styleId="DefaultParagraphFont">
     <w:name w:val="Default Paragraph Font"/>
     <w:uiPriority w:val="1"/>
-    <w:semiHidden/>
     <w:unhideWhenUsed/>
   </w:style>
   <w:style w:type="table" w:default="1" w:styleId="TableNormal">
@@ -8265,6 +8309,30 @@
       <w:color w:val="0000FF"/>
       <w:u w:val="single"/>
     </w:rPr>
+  </w:style>
+  <w:style w:type="paragraph" w:customStyle="1" w:styleId="paragraph">
+    <w:name w:val="paragraph"/>
+    <w:basedOn w:val="Normal"/>
+    <w:rsid w:val="005E3E1E"/>
+    <w:pPr>
+      <w:spacing w:before="100" w:beforeAutospacing="1" w:after="100" w:afterAutospacing="1" w:line="240" w:lineRule="auto"/>
+    </w:pPr>
+    <w:rPr>
+      <w:rFonts w:ascii="Times New Roman" w:eastAsia="Times New Roman" w:hAnsi="Times New Roman" w:cs="Times New Roman"/>
+      <w:kern w:val="0"/>
+      <w:lang w:eastAsia="en-ZA"/>
+      <w14:ligatures w14:val="none"/>
+    </w:rPr>
+  </w:style>
+  <w:style w:type="character" w:customStyle="1" w:styleId="normaltextrun">
+    <w:name w:val="normaltextrun"/>
+    <w:basedOn w:val="DefaultParagraphFont"/>
+    <w:rsid w:val="005E3E1E"/>
+  </w:style>
+  <w:style w:type="character" w:customStyle="1" w:styleId="eop">
+    <w:name w:val="eop"/>
+    <w:basedOn w:val="DefaultParagraphFont"/>
+    <w:rsid w:val="005E3E1E"/>
   </w:style>
 </w:styles>
 </file>

</xml_diff>